<commit_message>
add final project parts
</commit_message>
<xml_diff>
--- a/Homework6/Homework6 Report.docx
+++ b/Homework6/Homework6 Report.docx
@@ -453,6 +453,124 @@
     </w:p>
     <w:p>
       <w:pPr>
+        <w:pStyle w:val="ListParagraph"/>
+        <w:numPr>
+          <w:ilvl w:val="0"/>
+          <w:numId w:val="4"/>
+        </w:numPr>
+        <w:rPr>
+          <w:b/>
+          <w:lang w:eastAsia="zh-TW"/>
+        </w:rPr>
+      </w:pPr>
+      <w:r>
+        <w:rPr>
+          <w:b/>
+          <w:lang w:eastAsia="zh-TW"/>
+        </w:rPr>
+        <w:t>FSM state transition diagram</w:t>
+      </w:r>
+    </w:p>
+    <w:p>
+      <w:pPr>
+        <w:pStyle w:val="ListParagraph"/>
+        <w:rPr>
+          <w:b/>
+          <w:lang w:eastAsia="zh-TW"/>
+        </w:rPr>
+      </w:pPr>
+      <w:r>
+        <w:rPr>
+          <w:b/>
+          <w:lang w:eastAsia="zh-TW"/>
+        </w:rPr>
+        <w:drawing>
+          <wp:inline distT="0" distB="0" distL="0" distR="0" wp14:anchorId="1F27F042" wp14:editId="0DEB3458">
+            <wp:extent cx="3343701" cy="1511476"/>
+            <wp:effectExtent l="0" t="0" r="9525" b="0"/>
+            <wp:docPr id="1780870513" name="Picture 1"/>
+            <wp:cNvGraphicFramePr>
+              <a:graphicFrameLocks xmlns:a="http://schemas.openxmlformats.org/drawingml/2006/main" noChangeAspect="1"/>
+            </wp:cNvGraphicFramePr>
+            <a:graphic xmlns:a="http://schemas.openxmlformats.org/drawingml/2006/main">
+              <a:graphicData uri="http://schemas.openxmlformats.org/drawingml/2006/picture">
+                <pic:pic xmlns:pic="http://schemas.openxmlformats.org/drawingml/2006/picture">
+                  <pic:nvPicPr>
+                    <pic:cNvPr id="1780870513" name=""/>
+                    <pic:cNvPicPr/>
+                  </pic:nvPicPr>
+                  <pic:blipFill>
+                    <a:blip r:embed="rId10"/>
+                    <a:stretch>
+                      <a:fillRect/>
+                    </a:stretch>
+                  </pic:blipFill>
+                  <pic:spPr>
+                    <a:xfrm>
+                      <a:off x="0" y="0"/>
+                      <a:ext cx="3355327" cy="1516732"/>
+                    </a:xfrm>
+                    <a:prstGeom prst="rect">
+                      <a:avLst/>
+                    </a:prstGeom>
+                  </pic:spPr>
+                </pic:pic>
+              </a:graphicData>
+            </a:graphic>
+          </wp:inline>
+        </w:drawing>
+      </w:r>
+      <w:r>
+        <w:rPr>
+          <w:noProof/>
+          <w14:ligatures w14:val="standardContextual"/>
+        </w:rPr>
+        <w:t xml:space="preserve"> </w:t>
+      </w:r>
+      <w:r>
+        <w:rPr>
+          <w:b/>
+          <w:lang w:eastAsia="zh-TW"/>
+        </w:rPr>
+        <w:drawing>
+          <wp:inline distT="0" distB="0" distL="0" distR="0" wp14:anchorId="6EF74773" wp14:editId="58C7821D">
+            <wp:extent cx="2524836" cy="1455287"/>
+            <wp:effectExtent l="0" t="0" r="0" b="0"/>
+            <wp:docPr id="1557714860" name="Picture 1"/>
+            <wp:cNvGraphicFramePr>
+              <a:graphicFrameLocks xmlns:a="http://schemas.openxmlformats.org/drawingml/2006/main" noChangeAspect="1"/>
+            </wp:cNvGraphicFramePr>
+            <a:graphic xmlns:a="http://schemas.openxmlformats.org/drawingml/2006/main">
+              <a:graphicData uri="http://schemas.openxmlformats.org/drawingml/2006/picture">
+                <pic:pic xmlns:pic="http://schemas.openxmlformats.org/drawingml/2006/picture">
+                  <pic:nvPicPr>
+                    <pic:cNvPr id="1557714860" name=""/>
+                    <pic:cNvPicPr/>
+                  </pic:nvPicPr>
+                  <pic:blipFill>
+                    <a:blip r:embed="rId11"/>
+                    <a:stretch>
+                      <a:fillRect/>
+                    </a:stretch>
+                  </pic:blipFill>
+                  <pic:spPr>
+                    <a:xfrm>
+                      <a:off x="0" y="0"/>
+                      <a:ext cx="2530129" cy="1458338"/>
+                    </a:xfrm>
+                    <a:prstGeom prst="rect">
+                      <a:avLst/>
+                    </a:prstGeom>
+                  </pic:spPr>
+                </pic:pic>
+              </a:graphicData>
+            </a:graphic>
+          </wp:inline>
+        </w:drawing>
+      </w:r>
+    </w:p>
+    <w:p>
+      <w:pPr>
         <w:spacing w:line="278" w:lineRule="auto"/>
         <w:rPr>
           <w:b/>
@@ -511,7 +629,7 @@
                     <pic:cNvPicPr/>
                   </pic:nvPicPr>
                   <pic:blipFill>
-                    <a:blip r:embed="rId10"/>
+                    <a:blip r:embed="rId12"/>
                     <a:stretch>
                       <a:fillRect/>
                     </a:stretch>
@@ -569,25 +687,7 @@
           <w:b/>
           <w:lang w:eastAsia="zh-TW"/>
         </w:rPr>
-        <w:t xml:space="preserve"> a total of 15, the open flag is high. The implementation </w:t>
-      </w:r>
-      <w:proofErr w:type="gramStart"/>
-      <w:r>
-        <w:rPr>
-          <w:rFonts w:hint="eastAsia"/>
-          <w:b/>
-          <w:lang w:eastAsia="zh-TW"/>
-        </w:rPr>
-        <w:t>remove</w:t>
-      </w:r>
-      <w:proofErr w:type="gramEnd"/>
-      <w:r>
-        <w:rPr>
-          <w:rFonts w:hint="eastAsia"/>
-          <w:b/>
-          <w:lang w:eastAsia="zh-TW"/>
-        </w:rPr>
-        <w:t xml:space="preserve"> the state CENTS_15 as it</w:t>
+        <w:t xml:space="preserve"> a total of 15, the open flag is high. The implementation remove the state CENTS_15 as it</w:t>
       </w:r>
       <w:r>
         <w:rPr>
@@ -665,7 +765,7 @@
         <w:pStyle w:val="ListParagraph"/>
         <w:numPr>
           <w:ilvl w:val="0"/>
-          <w:numId w:val="12"/>
+          <w:numId w:val="4"/>
         </w:numPr>
         <w:rPr>
           <w:b/>
@@ -710,7 +810,7 @@
                     <pic:cNvPicPr/>
                   </pic:nvPicPr>
                   <pic:blipFill>
-                    <a:blip r:embed="rId11"/>
+                    <a:blip r:embed="rId13"/>
                     <a:stretch>
                       <a:fillRect/>
                     </a:stretch>
@@ -761,7 +861,7 @@
                     <pic:cNvPicPr/>
                   </pic:nvPicPr>
                   <pic:blipFill>
-                    <a:blip r:embed="rId12"/>
+                    <a:blip r:embed="rId14"/>
                     <a:stretch>
                       <a:fillRect/>
                     </a:stretch>
@@ -803,7 +903,7 @@
         <w:pStyle w:val="ListParagraph"/>
         <w:numPr>
           <w:ilvl w:val="0"/>
-          <w:numId w:val="12"/>
+          <w:numId w:val="4"/>
         </w:numPr>
         <w:rPr>
           <w:b/>
@@ -849,7 +949,7 @@
                     <pic:cNvPicPr/>
                   </pic:nvPicPr>
                   <pic:blipFill>
-                    <a:blip r:embed="rId13"/>
+                    <a:blip r:embed="rId15"/>
                     <a:stretch>
                       <a:fillRect/>
                     </a:stretch>
@@ -885,9 +985,9 @@
           <w:lang w:eastAsia="zh-TW"/>
         </w:rPr>
         <w:drawing>
-          <wp:inline distT="0" distB="0" distL="0" distR="0" wp14:anchorId="55B7F970" wp14:editId="1D33CBEB">
-            <wp:extent cx="6858000" cy="2320925"/>
-            <wp:effectExtent l="0" t="0" r="0" b="3175"/>
+          <wp:inline distT="0" distB="0" distL="0" distR="0" wp14:anchorId="55B7F970" wp14:editId="7B8173AE">
+            <wp:extent cx="5909481" cy="1999922"/>
+            <wp:effectExtent l="0" t="0" r="0" b="635"/>
             <wp:docPr id="994817357" name="Picture 1"/>
             <wp:cNvGraphicFramePr>
               <a:graphicFrameLocks xmlns:a="http://schemas.openxmlformats.org/drawingml/2006/main" noChangeAspect="1"/>
@@ -900,7 +1000,7 @@
                     <pic:cNvPicPr/>
                   </pic:nvPicPr>
                   <pic:blipFill>
-                    <a:blip r:embed="rId14"/>
+                    <a:blip r:embed="rId16"/>
                     <a:stretch>
                       <a:fillRect/>
                     </a:stretch>
@@ -908,7 +1008,7 @@
                   <pic:spPr>
                     <a:xfrm>
                       <a:off x="0" y="0"/>
-                      <a:ext cx="6858000" cy="2320925"/>
+                      <a:ext cx="5920212" cy="2003554"/>
                     </a:xfrm>
                     <a:prstGeom prst="rect">
                       <a:avLst/>
@@ -942,7 +1042,7 @@
         <w:pStyle w:val="ListParagraph"/>
         <w:numPr>
           <w:ilvl w:val="0"/>
-          <w:numId w:val="12"/>
+          <w:numId w:val="4"/>
         </w:numPr>
         <w:rPr>
           <w:b/>
@@ -988,7 +1088,7 @@
                     <pic:cNvPicPr/>
                   </pic:nvPicPr>
                   <pic:blipFill>
-                    <a:blip r:embed="rId15"/>
+                    <a:blip r:embed="rId17"/>
                     <a:stretch>
                       <a:fillRect/>
                     </a:stretch>
@@ -1063,7 +1163,7 @@
         <w:pStyle w:val="ListParagraph"/>
         <w:numPr>
           <w:ilvl w:val="0"/>
-          <w:numId w:val="12"/>
+          <w:numId w:val="4"/>
         </w:numPr>
         <w:rPr>
           <w:b/>
@@ -1108,7 +1208,7 @@
                     <pic:cNvPicPr/>
                   </pic:nvPicPr>
                   <pic:blipFill>
-                    <a:blip r:embed="rId16"/>
+                    <a:blip r:embed="rId18"/>
                     <a:stretch>
                       <a:fillRect/>
                     </a:stretch>
@@ -1159,7 +1259,7 @@
                     <pic:cNvPicPr/>
                   </pic:nvPicPr>
                   <pic:blipFill>
-                    <a:blip r:embed="rId17"/>
+                    <a:blip r:embed="rId19"/>
                     <a:stretch>
                       <a:fillRect/>
                     </a:stretch>
@@ -1272,7 +1372,7 @@
       <w:pPr>
         <w:pStyle w:val="Heading2"/>
         <w:rPr>
-          <w:rFonts w:eastAsiaTheme="minorEastAsia" w:hint="eastAsia"/>
+          <w:rFonts w:eastAsiaTheme="minorEastAsia"/>
           <w:lang w:eastAsia="zh-TW"/>
         </w:rPr>
       </w:pPr>
@@ -1308,6 +1408,7 @@
       <w:r>
         <w:rPr>
           <w:rFonts w:eastAsia="游ゴシック"/>
+          <w:noProof/>
           <w:lang w:eastAsia="ja-JP"/>
         </w:rPr>
         <w:drawing>
@@ -1326,7 +1427,7 @@
                     <pic:cNvPicPr/>
                   </pic:nvPicPr>
                   <pic:blipFill>
-                    <a:blip r:embed="rId18"/>
+                    <a:blip r:embed="rId20"/>
                     <a:stretch>
                       <a:fillRect/>
                     </a:stretch>
@@ -1357,6 +1458,7 @@
       <w:r>
         <w:rPr>
           <w:rFonts w:eastAsia="游ゴシック"/>
+          <w:noProof/>
           <w:lang w:eastAsia="ja-JP"/>
         </w:rPr>
         <w:drawing>
@@ -1375,7 +1477,7 @@
                     <pic:cNvPicPr/>
                   </pic:nvPicPr>
                   <pic:blipFill>
-                    <a:blip r:embed="rId19"/>
+                    <a:blip r:embed="rId21"/>
                     <a:stretch>
                       <a:fillRect/>
                     </a:stretch>
@@ -1406,6 +1508,7 @@
       <w:r>
         <w:rPr>
           <w:rFonts w:eastAsia="游ゴシック"/>
+          <w:noProof/>
           <w:lang w:eastAsia="ja-JP"/>
         </w:rPr>
         <w:drawing>
@@ -1424,7 +1527,7 @@
                     <pic:cNvPicPr/>
                   </pic:nvPicPr>
                   <pic:blipFill>
-                    <a:blip r:embed="rId20"/>
+                    <a:blip r:embed="rId22"/>
                     <a:stretch>
                       <a:fillRect/>
                     </a:stretch>
@@ -1454,6 +1557,7 @@
       <w:r>
         <w:rPr>
           <w:rFonts w:eastAsia="游ゴシック"/>
+          <w:noProof/>
           <w:lang w:eastAsia="ja-JP"/>
         </w:rPr>
         <w:drawing>
@@ -1472,7 +1576,7 @@
                     <pic:cNvPicPr/>
                   </pic:nvPicPr>
                   <pic:blipFill>
-                    <a:blip r:embed="rId21"/>
+                    <a:blip r:embed="rId23"/>
                     <a:stretch>
                       <a:fillRect/>
                     </a:stretch>
@@ -1556,6 +1660,7 @@
       </w:pPr>
       <w:r>
         <w:rPr>
+          <w:noProof/>
           <w:lang w:eastAsia="zh-TW"/>
         </w:rPr>
         <w:drawing>
@@ -1574,7 +1679,7 @@
                     <pic:cNvPicPr/>
                   </pic:nvPicPr>
                   <pic:blipFill>
-                    <a:blip r:embed="rId22"/>
+                    <a:blip r:embed="rId24"/>
                     <a:stretch>
                       <a:fillRect/>
                     </a:stretch>
@@ -1637,6 +1742,7 @@
       </w:pPr>
       <w:r>
         <w:rPr>
+          <w:noProof/>
           <w:lang w:eastAsia="zh-TW"/>
         </w:rPr>
         <w:drawing>
@@ -1655,7 +1761,7 @@
                     <pic:cNvPicPr/>
                   </pic:nvPicPr>
                   <pic:blipFill>
-                    <a:blip r:embed="rId23"/>
+                    <a:blip r:embed="rId25"/>
                     <a:stretch>
                       <a:fillRect/>
                     </a:stretch>
@@ -1698,6 +1804,7 @@
       </w:pPr>
       <w:r>
         <w:rPr>
+          <w:noProof/>
           <w:lang w:eastAsia="zh-TW"/>
         </w:rPr>
         <w:drawing>
@@ -1716,7 +1823,7 @@
                     <pic:cNvPicPr/>
                   </pic:nvPicPr>
                   <pic:blipFill>
-                    <a:blip r:embed="rId24"/>
+                    <a:blip r:embed="rId26"/>
                     <a:stretch>
                       <a:fillRect/>
                     </a:stretch>
@@ -1784,6 +1891,7 @@
       <w:r>
         <w:rPr>
           <w:rFonts w:asciiTheme="majorHAnsi" w:eastAsiaTheme="majorEastAsia" w:hAnsiTheme="majorHAnsi" w:cstheme="majorBidi"/>
+          <w:noProof/>
           <w:color w:val="0F4761" w:themeColor="accent1" w:themeShade="BF"/>
           <w:sz w:val="32"/>
           <w:szCs w:val="32"/>
@@ -1805,7 +1913,7 @@
                     <pic:cNvPicPr/>
                   </pic:nvPicPr>
                   <pic:blipFill>
-                    <a:blip r:embed="rId25"/>
+                    <a:blip r:embed="rId27"/>
                     <a:stretch>
                       <a:fillRect/>
                     </a:stretch>
@@ -1829,44 +1937,44 @@
     <w:p>
       <w:pPr>
         <w:rPr>
+          <w:rFonts w:asciiTheme="majorHAnsi" w:eastAsiaTheme="majorEastAsia" w:hAnsiTheme="majorHAnsi" w:cstheme="majorBidi"/>
+          <w:color w:val="0F4761" w:themeColor="accent1" w:themeShade="BF"/>
+          <w:sz w:val="32"/>
+          <w:szCs w:val="32"/>
+          <w:lang w:eastAsia="zh-TW"/>
+        </w:rPr>
+      </w:pPr>
+      <w:r>
+        <w:rPr>
+          <w:rFonts w:asciiTheme="majorHAnsi" w:eastAsiaTheme="majorEastAsia" w:hAnsiTheme="majorHAnsi" w:cstheme="majorBidi"/>
+          <w:color w:val="0F4761" w:themeColor="accent1" w:themeShade="BF"/>
+          <w:sz w:val="32"/>
+          <w:szCs w:val="32"/>
+          <w:lang w:eastAsia="zh-TW"/>
+        </w:rPr>
+        <w:t>Simulation snapshot</w:t>
+      </w:r>
+      <w:r>
+        <w:rPr>
           <w:rFonts w:asciiTheme="majorHAnsi" w:eastAsiaTheme="majorEastAsia" w:hAnsiTheme="majorHAnsi" w:cstheme="majorBidi" w:hint="eastAsia"/>
           <w:color w:val="0F4761" w:themeColor="accent1" w:themeShade="BF"/>
           <w:sz w:val="32"/>
           <w:szCs w:val="32"/>
           <w:lang w:eastAsia="zh-TW"/>
         </w:rPr>
-      </w:pPr>
-      <w:r>
-        <w:rPr>
-          <w:rFonts w:asciiTheme="majorHAnsi" w:eastAsiaTheme="majorEastAsia" w:hAnsiTheme="majorHAnsi" w:cstheme="majorBidi"/>
-          <w:color w:val="0F4761" w:themeColor="accent1" w:themeShade="BF"/>
-          <w:sz w:val="32"/>
-          <w:szCs w:val="32"/>
-          <w:lang w:eastAsia="zh-TW"/>
-        </w:rPr>
-        <w:t>Simulation snapshot</w:t>
-      </w:r>
-      <w:r>
-        <w:rPr>
-          <w:rFonts w:asciiTheme="majorHAnsi" w:eastAsiaTheme="majorEastAsia" w:hAnsiTheme="majorHAnsi" w:cstheme="majorBidi" w:hint="eastAsia"/>
-          <w:color w:val="0F4761" w:themeColor="accent1" w:themeShade="BF"/>
-          <w:sz w:val="32"/>
-          <w:szCs w:val="32"/>
-          <w:lang w:eastAsia="zh-TW"/>
-        </w:rPr>
         <w:t xml:space="preserve"> &amp; Transcript &amp; Explanation</w:t>
       </w:r>
     </w:p>
     <w:p>
       <w:pPr>
         <w:rPr>
-          <w:rFonts w:hint="eastAsia"/>
           <w:lang w:eastAsia="zh-TW"/>
         </w:rPr>
       </w:pPr>
       <w:r>
         <w:rPr>
           <w:rFonts w:eastAsia="游ゴシック"/>
+          <w:noProof/>
           <w:lang w:eastAsia="ja-JP"/>
         </w:rPr>
         <w:drawing>
@@ -1885,7 +1993,7 @@
                     <pic:cNvPicPr/>
                   </pic:nvPicPr>
                   <pic:blipFill>
-                    <a:blip r:embed="rId26"/>
+                    <a:blip r:embed="rId28"/>
                     <a:stretch>
                       <a:fillRect/>
                     </a:stretch>
@@ -1909,13 +2017,14 @@
     <w:p>
       <w:pPr>
         <w:rPr>
-          <w:rFonts w:eastAsia="游ゴシック" w:hint="eastAsia"/>
+          <w:rFonts w:eastAsia="游ゴシック"/>
           <w:lang w:eastAsia="ja-JP"/>
         </w:rPr>
       </w:pPr>
       <w:r>
         <w:rPr>
           <w:rFonts w:eastAsia="游ゴシック"/>
+          <w:noProof/>
           <w:lang w:eastAsia="ja-JP"/>
         </w:rPr>
         <w:drawing>
@@ -1934,7 +2043,7 @@
                     <pic:cNvPicPr/>
                   </pic:nvPicPr>
                   <pic:blipFill>
-                    <a:blip r:embed="rId27"/>
+                    <a:blip r:embed="rId29"/>
                     <a:stretch>
                       <a:fillRect/>
                     </a:stretch>
@@ -2012,23 +2121,7 @@
           <w:rFonts w:hint="eastAsia"/>
           <w:lang w:eastAsia="zh-TW"/>
         </w:rPr>
-        <w:t xml:space="preserve"> is calculated and the done flag is up once the cycle finished. The entire simulation </w:t>
-      </w:r>
-      <w:proofErr w:type="gramStart"/>
-      <w:r>
-        <w:rPr>
-          <w:rFonts w:hint="eastAsia"/>
-          <w:lang w:eastAsia="zh-TW"/>
-        </w:rPr>
-        <w:t>produce</w:t>
-      </w:r>
-      <w:proofErr w:type="gramEnd"/>
-      <w:r>
-        <w:rPr>
-          <w:rFonts w:hint="eastAsia"/>
-          <w:lang w:eastAsia="zh-TW"/>
-        </w:rPr>
-        <w:t xml:space="preserve"> three products which are correct based on the input multiplicand and multiplier. </w:t>
+        <w:t xml:space="preserve"> is calculated and the done flag is up once the cycle finished. The entire simulation produce three products which are correct based on the input multiplicand and multiplier. </w:t>
       </w:r>
     </w:p>
     <w:p>
@@ -2084,27 +2177,27 @@
           <w:u w:val="single"/>
           <w:lang w:eastAsia="zh-TW"/>
         </w:rPr>
-        <w:t>6</w:t>
-      </w:r>
-      <w:r>
-        <w:rPr>
-          <w:rFonts w:asciiTheme="minorHAnsi" w:hAnsiTheme="minorHAnsi" w:hint="eastAsia"/>
+        <w:t>6c</w:t>
+      </w:r>
+      <w:r>
+        <w:rPr>
+          <w:rFonts w:asciiTheme="minorHAnsi" w:hAnsiTheme="minorHAnsi"/>
           <w:b/>
           <w:bCs/>
           <w:u w:val="single"/>
           <w:lang w:eastAsia="zh-TW"/>
         </w:rPr>
-        <w:t>c</w:t>
-      </w:r>
-      <w:r>
-        <w:rPr>
-          <w:rFonts w:asciiTheme="minorHAnsi" w:hAnsiTheme="minorHAnsi"/>
+        <w:t xml:space="preserve"> (</w:t>
+      </w:r>
+      <w:r>
+        <w:rPr>
+          <w:rFonts w:asciiTheme="minorHAnsi" w:hAnsiTheme="minorHAnsi" w:hint="eastAsia"/>
           <w:b/>
           <w:bCs/>
           <w:u w:val="single"/>
           <w:lang w:eastAsia="zh-TW"/>
         </w:rPr>
-        <w:t xml:space="preserve"> (</w:t>
+        <w:t>Booth</w:t>
       </w:r>
       <w:r>
         <w:rPr>
@@ -2114,7 +2207,7 @@
           <w:u w:val="single"/>
           <w:lang w:eastAsia="zh-TW"/>
         </w:rPr>
-        <w:t>Integer Multiplier</w:t>
+        <w:t xml:space="preserve"> Multiplier</w:t>
       </w:r>
       <w:r>
         <w:rPr>
@@ -2131,21 +2224,20 @@
       <w:pPr>
         <w:pStyle w:val="Heading2"/>
         <w:rPr>
+          <w:lang w:eastAsia="zh-TW"/>
+        </w:rPr>
+      </w:pPr>
+      <w:r>
+        <w:rPr>
+          <w:lang w:eastAsia="zh-TW"/>
+        </w:rPr>
+        <w:t>SystemVerilog FSM design code</w:t>
+      </w:r>
+      <w:r>
+        <w:rPr>
           <w:rFonts w:hint="eastAsia"/>
           <w:lang w:eastAsia="zh-TW"/>
         </w:rPr>
-      </w:pPr>
-      <w:r>
-        <w:rPr>
-          <w:lang w:eastAsia="zh-TW"/>
-        </w:rPr>
-        <w:t>SystemVerilog FSM design code</w:t>
-      </w:r>
-      <w:r>
-        <w:rPr>
-          <w:rFonts w:hint="eastAsia"/>
-          <w:lang w:eastAsia="zh-TW"/>
-        </w:rPr>
         <w:t xml:space="preserve"> (Student Added Parts)</w:t>
       </w:r>
     </w:p>
@@ -2157,6 +2249,7 @@
       </w:pPr>
       <w:r>
         <w:rPr>
+          <w:noProof/>
           <w:lang w:eastAsia="zh-TW"/>
         </w:rPr>
         <w:drawing>
@@ -2175,7 +2268,7 @@
                     <pic:cNvPicPr/>
                   </pic:nvPicPr>
                   <pic:blipFill>
-                    <a:blip r:embed="rId28"/>
+                    <a:blip r:embed="rId30"/>
                     <a:stretch>
                       <a:fillRect/>
                     </a:stretch>
@@ -2204,6 +2297,7 @@
       </w:r>
       <w:r>
         <w:rPr>
+          <w:noProof/>
           <w:lang w:eastAsia="zh-TW"/>
         </w:rPr>
         <w:drawing>
@@ -2222,7 +2316,7 @@
                     <pic:cNvPicPr/>
                   </pic:nvPicPr>
                   <pic:blipFill>
-                    <a:blip r:embed="rId29"/>
+                    <a:blip r:embed="rId31"/>
                     <a:stretch>
                       <a:fillRect/>
                     </a:stretch>
@@ -2251,6 +2345,7 @@
       </w:pPr>
       <w:r>
         <w:rPr>
+          <w:noProof/>
           <w:lang w:eastAsia="zh-TW"/>
         </w:rPr>
         <w:drawing>
@@ -2269,7 +2364,7 @@
                     <pic:cNvPicPr/>
                   </pic:nvPicPr>
                   <pic:blipFill>
-                    <a:blip r:embed="rId30"/>
+                    <a:blip r:embed="rId32"/>
                     <a:stretch>
                       <a:fillRect/>
                     </a:stretch>
@@ -2291,6 +2386,7 @@
       </w:r>
       <w:r>
         <w:rPr>
+          <w:noProof/>
           <w:lang w:eastAsia="zh-TW"/>
         </w:rPr>
         <w:drawing>
@@ -2309,7 +2405,7 @@
                     <pic:cNvPicPr/>
                   </pic:nvPicPr>
                   <pic:blipFill>
-                    <a:blip r:embed="rId31"/>
+                    <a:blip r:embed="rId33"/>
                     <a:stretch>
                       <a:fillRect/>
                     </a:stretch>
@@ -2374,12 +2470,12 @@
     <w:p>
       <w:pPr>
         <w:rPr>
-          <w:rFonts w:hint="eastAsia"/>
-          <w:lang w:eastAsia="zh-TW"/>
-        </w:rPr>
-      </w:pPr>
-      <w:r>
-        <w:rPr>
+          <w:lang w:eastAsia="zh-TW"/>
+        </w:rPr>
+      </w:pPr>
+      <w:r>
+        <w:rPr>
+          <w:noProof/>
           <w:lang w:eastAsia="zh-TW"/>
         </w:rPr>
         <w:drawing>
@@ -2398,7 +2494,7 @@
                     <pic:cNvPicPr/>
                   </pic:nvPicPr>
                   <pic:blipFill>
-                    <a:blip r:embed="rId32"/>
+                    <a:blip r:embed="rId34"/>
                     <a:stretch>
                       <a:fillRect/>
                     </a:stretch>
@@ -2427,6 +2523,7 @@
       </w:pPr>
       <w:r>
         <w:rPr>
+          <w:noProof/>
           <w:lang w:eastAsia="zh-TW"/>
         </w:rPr>
         <w:drawing>
@@ -2445,7 +2542,7 @@
                     <pic:cNvPicPr/>
                   </pic:nvPicPr>
                   <pic:blipFill>
-                    <a:blip r:embed="rId33"/>
+                    <a:blip r:embed="rId35"/>
                     <a:stretch>
                       <a:fillRect/>
                     </a:stretch>
@@ -2540,6 +2637,7 @@
       <w:r>
         <w:rPr>
           <w:rFonts w:asciiTheme="majorHAnsi" w:eastAsiaTheme="majorEastAsia" w:hAnsiTheme="majorHAnsi" w:cstheme="majorBidi"/>
+          <w:noProof/>
           <w:color w:val="0F4761" w:themeColor="accent1" w:themeShade="BF"/>
           <w:sz w:val="32"/>
           <w:szCs w:val="32"/>
@@ -2561,7 +2659,7 @@
                     <pic:cNvPicPr/>
                   </pic:nvPicPr>
                   <pic:blipFill>
-                    <a:blip r:embed="rId34"/>
+                    <a:blip r:embed="rId36"/>
                     <a:stretch>
                       <a:fillRect/>
                     </a:stretch>
@@ -2605,6 +2703,7 @@
       </w:pPr>
       <w:r>
         <w:rPr>
+          <w:noProof/>
           <w:lang w:eastAsia="zh-TW"/>
         </w:rPr>
         <w:drawing>
@@ -2623,7 +2722,7 @@
                     <pic:cNvPicPr/>
                   </pic:nvPicPr>
                   <pic:blipFill>
-                    <a:blip r:embed="rId35"/>
+                    <a:blip r:embed="rId37"/>
                     <a:stretch>
                       <a:fillRect/>
                     </a:stretch>
@@ -2648,21 +2747,20 @@
       <w:pPr>
         <w:pStyle w:val="Heading2"/>
         <w:rPr>
+          <w:lang w:eastAsia="zh-TW"/>
+        </w:rPr>
+      </w:pPr>
+      <w:r>
+        <w:rPr>
+          <w:lang w:eastAsia="zh-TW"/>
+        </w:rPr>
+        <w:t>Simulation snapshot</w:t>
+      </w:r>
+      <w:r>
+        <w:rPr>
           <w:rFonts w:hint="eastAsia"/>
           <w:lang w:eastAsia="zh-TW"/>
         </w:rPr>
-      </w:pPr>
-      <w:r>
-        <w:rPr>
-          <w:lang w:eastAsia="zh-TW"/>
-        </w:rPr>
-        <w:t>Simulation snapshot</w:t>
-      </w:r>
-      <w:r>
-        <w:rPr>
-          <w:rFonts w:hint="eastAsia"/>
-          <w:lang w:eastAsia="zh-TW"/>
-        </w:rPr>
         <w:t xml:space="preserve"> &amp; Explanation &amp; Transcript</w:t>
       </w:r>
     </w:p>
@@ -2674,6 +2772,7 @@
       </w:pPr>
       <w:r>
         <w:rPr>
+          <w:noProof/>
           <w:lang w:eastAsia="zh-TW"/>
         </w:rPr>
         <w:drawing>
@@ -2692,7 +2791,7 @@
                     <pic:cNvPicPr/>
                   </pic:nvPicPr>
                   <pic:blipFill>
-                    <a:blip r:embed="rId36"/>
+                    <a:blip r:embed="rId38"/>
                     <a:stretch>
                       <a:fillRect/>
                     </a:stretch>
@@ -2721,6 +2820,7 @@
       </w:pPr>
       <w:r>
         <w:rPr>
+          <w:noProof/>
           <w:lang w:eastAsia="zh-TW"/>
         </w:rPr>
         <w:drawing>
@@ -2739,7 +2839,7 @@
                     <pic:cNvPicPr/>
                   </pic:nvPicPr>
                   <pic:blipFill>
-                    <a:blip r:embed="rId37"/>
+                    <a:blip r:embed="rId39"/>
                     <a:stretch>
                       <a:fillRect/>
                     </a:stretch>
@@ -2763,80 +2863,46 @@
     <w:p>
       <w:pPr>
         <w:rPr>
+          <w:lang w:eastAsia="zh-TW"/>
+        </w:rPr>
+      </w:pPr>
+      <w:r>
+        <w:rPr>
           <w:rFonts w:hint="eastAsia"/>
           <w:lang w:eastAsia="zh-TW"/>
         </w:rPr>
-      </w:pPr>
+        <w:t xml:space="preserve">The simulation result shows all </w:t>
+      </w:r>
+      <w:r>
+        <w:rPr>
+          <w:lang w:eastAsia="zh-TW"/>
+        </w:rPr>
+        <w:t>tests</w:t>
+      </w:r>
       <w:r>
         <w:rPr>
           <w:rFonts w:hint="eastAsia"/>
           <w:lang w:eastAsia="zh-TW"/>
         </w:rPr>
-        <w:t xml:space="preserve">The simulation result shows all </w:t>
-      </w:r>
-      <w:r>
-        <w:rPr>
-          <w:lang w:eastAsia="zh-TW"/>
-        </w:rPr>
-        <w:t>tests</w:t>
+        <w:t xml:space="preserve"> passed from the transcript. The above simulation wave is the first test case where you can see the next_state changes correctly between each </w:t>
+      </w:r>
+      <w:r>
+        <w:rPr>
+          <w:lang w:eastAsia="zh-TW"/>
+        </w:rPr>
+        <w:t>determined</w:t>
       </w:r>
       <w:r>
         <w:rPr>
           <w:rFonts w:hint="eastAsia"/>
           <w:lang w:eastAsia="zh-TW"/>
         </w:rPr>
-        <w:t xml:space="preserve"> passed from the transcript. The above simulation wave is the first test case where you can see the next_state changes correctly between each </w:t>
-      </w:r>
-      <w:r>
-        <w:rPr>
-          <w:lang w:eastAsia="zh-TW"/>
-        </w:rPr>
-        <w:t>determined</w:t>
-      </w:r>
-      <w:r>
-        <w:rPr>
-          <w:rFonts w:hint="eastAsia"/>
-          <w:lang w:eastAsia="zh-TW"/>
-        </w:rPr>
-        <w:t xml:space="preserve"> test shift_</w:t>
-      </w:r>
-      <w:proofErr w:type="gramStart"/>
-      <w:r>
-        <w:rPr>
-          <w:rFonts w:hint="eastAsia"/>
-          <w:lang w:eastAsia="zh-TW"/>
-        </w:rPr>
-        <w:t>reg[</w:t>
-      </w:r>
-      <w:proofErr w:type="gramEnd"/>
-      <w:r>
-        <w:rPr>
-          <w:rFonts w:hint="eastAsia"/>
-          <w:lang w:eastAsia="zh-TW"/>
-        </w:rPr>
-        <w:t xml:space="preserve">1:0] and update the shift_reg accordingly until the counter reaches the N count and return the product. The wave shows -8 * -8 which gives 64 in the product, the model works perfectly as </w:t>
-      </w:r>
-      <w:proofErr w:type="gramStart"/>
-      <w:r>
-        <w:rPr>
-          <w:rFonts w:hint="eastAsia"/>
-          <w:lang w:eastAsia="zh-TW"/>
-        </w:rPr>
-        <w:t>a</w:t>
-      </w:r>
-      <w:proofErr w:type="gramEnd"/>
-      <w:r>
-        <w:rPr>
-          <w:rFonts w:hint="eastAsia"/>
-          <w:lang w:eastAsia="zh-TW"/>
-        </w:rPr>
-        <w:t xml:space="preserve"> integer multiplier.</w:t>
-      </w:r>
-    </w:p>
-    <w:p>
-      <w:pPr>
-        <w:rPr>
-          <w:rFonts w:hint="eastAsia"/>
+        <w:t xml:space="preserve"> test shift_reg[1:0] and update the shift_reg accordingly until the counter reaches the N count and return the product. The wave shows -8 * -8 which gives 64 in the product, the model works perfectly as a integer multiplier.</w:t>
+      </w:r>
+    </w:p>
+    <w:p>
+      <w:pPr>
+        <w:rPr>
           <w:lang w:eastAsia="zh-TW"/>
         </w:rPr>
       </w:pPr>
@@ -4617,6 +4683,7 @@
   <w:style w:type="character" w:default="1" w:styleId="DefaultParagraphFont">
     <w:name w:val="Default Paragraph Font"/>
     <w:uiPriority w:val="1"/>
+    <w:semiHidden/>
     <w:unhideWhenUsed/>
   </w:style>
   <w:style w:type="table" w:default="1" w:styleId="TableNormal">

</xml_diff>